<commit_message>
Corrige resaltado amarillo y firmas rotas en written-pleadings
Se comparó un documento real generado con la plantilla (caso Sheraryn)
contra el documento de referencia real. Dos bugs de la cirugía original:
el .docx de ejemplo (Insuasti) traía todo el texto resaltado en amarillo,
que se copió sin querer al rPr de cada SDT; y 3 renglones de firma (bajo
el abogado, bajo cada Declaration) rompían a 2 líneas con nombres largos
por exceso de tabs/espacios calibrados para un nombre corto — se igualó
la cantidad exacta de tabs que usa el documento real que sí funciona.

dialecto_interprete pasa a ser opcional: si se deja vacío, conserva la
línea en blanco original en vez de bloquear la generación o vaciarla.

Co-Authored-By: Claude Sonnet 5 <noreply@anthropic.com>
Claude-Session: https://claude.ai/code/session_01SWKjmpLbnm4oMbZDEtfKhm
</commit_message>
<xml_diff>
--- a/plantillas/written-pleadings/WRITTEN_PLEADINGS.docx
+++ b/plantillas/written-pleadings/WRITTEN_PLEADINGS.docx
@@ -11,7 +11,6 @@
           <w:spacing w:val="-3"/>
           <w:sz w:val="24"/>
           <w:szCs w:val="24"/>
-          <w:highlight w:val="yellow"/>
           <w:lang w:val="es-AR"/>
         </w:rPr>
       </w:pPr>
@@ -23,7 +22,6 @@
             <w:spacing w:val="-3"/>
             <w:sz w:val="24"/>
             <w:szCs w:val="24"/>
-            <w:highlight w:val="yellow"/>
             <w:lang w:val="es-ES"/>
           </w:rPr>
         </w:sdtPr>
@@ -34,7 +32,6 @@
               <w:spacing w:val="-3"/>
               <w:sz w:val="24"/>
               <w:szCs w:val="24"/>
-              <w:highlight w:val="yellow"/>
               <w:lang w:val="es-ES"/>
             </w:rPr>
             <w:t xml:space="preserve">Raul Mejia Santos, Esq. (SBN 22998)</w:t>
@@ -68,7 +65,6 @@
           <w:rFonts w:ascii="Times New Roman" w:hAnsi="Times New Roman" w:cs="Times New Roman"/>
           <w:sz w:val="24"/>
           <w:szCs w:val="24"/>
-          <w:highlight w:val="yellow"/>
         </w:rPr>
       </w:pPr>
       <w:r>
@@ -84,7 +80,6 @@
           <w:rFonts w:ascii="Times New Roman" w:hAnsi="Times New Roman" w:cs="Times New Roman"/>
           <w:sz w:val="24"/>
           <w:szCs w:val="24"/>
-          <w:highlight w:val="yellow"/>
         </w:rPr>
         <w:t>2100</w:t>
       </w:r>
@@ -199,7 +194,6 @@
             <w:rFonts w:ascii="Times New Roman" w:hAnsi="Times New Roman" w:cs="Times New Roman"/>
             <w:sz w:val="24"/>
             <w:szCs w:val="24"/>
-            <w:highlight w:val="yellow"/>
           </w:rPr>
         </w:sdtPr>
         <w:sdtContent>
@@ -208,7 +202,6 @@
               <w:rFonts w:ascii="Times New Roman" w:hAnsi="Times New Roman" w:cs="Times New Roman"/>
               <w:sz w:val="24"/>
               <w:szCs w:val="24"/>
-              <w:highlight w:val="yellow"/>
             </w:rPr>
             <w:t>INSUASTI RUIZ, EDWIN ALBERTO</w:t>
           </w:r>
@@ -321,7 +314,6 @@
             <w:bCs/>
             <w:sz w:val="24"/>
             <w:szCs w:val="24"/>
-            <w:highlight w:val="yellow"/>
           </w:rPr>
         </w:sdtPr>
         <w:sdtContent>
@@ -332,7 +324,6 @@
               <w:bCs/>
               <w:sz w:val="24"/>
               <w:szCs w:val="24"/>
-              <w:highlight w:val="yellow"/>
             </w:rPr>
             <w:t>SANTA, ANA</w:t>
           </w:r>
@@ -509,7 +500,6 @@
             <w:rFonts w:ascii="Times New Roman" w:hAnsi="Times New Roman" w:cs="Times New Roman"/>
             <w:sz w:val="24"/>
             <w:szCs w:val="24"/>
-            <w:highlight w:val="yellow"/>
             <w:lang w:val="es-MX"/>
           </w:rPr>
         </w:sdtPr>
@@ -519,7 +509,6 @@
               <w:rFonts w:ascii="Times New Roman" w:hAnsi="Times New Roman" w:cs="Times New Roman"/>
               <w:sz w:val="24"/>
               <w:szCs w:val="24"/>
-              <w:highlight w:val="yellow"/>
               <w:lang w:val="es-MX"/>
             </w:rPr>
             <w:t>INSUASTI RUIZ, EDWIN ALBERTO</w:t>
@@ -528,7 +517,6 @@
       </w:sdt>
       <w:r>
         <w:rPr>
-          <w:highlight w:val="yellow"/>
           <w:lang w:val="es-MX"/>
         </w:rPr>
         <w:t xml:space="preserve">     </w:t>
@@ -596,7 +584,6 @@
             <w:spacing w:val="-3"/>
             <w:sz w:val="24"/>
             <w:szCs w:val="24"/>
-            <w:highlight w:val="yellow"/>
           </w:rPr>
         </w:sdtPr>
         <w:sdtContent>
@@ -606,7 +593,6 @@
               <w:spacing w:val="-3"/>
               <w:sz w:val="24"/>
               <w:szCs w:val="24"/>
-              <w:highlight w:val="yellow"/>
             </w:rPr>
             <w:t>245-870-935</w:t>
           </w:r>
@@ -797,7 +783,6 @@
           <w:rPr>
             <w:rFonts w:ascii="Times New Roman" w:hAnsi="Times New Roman" w:cs="Times New Roman"/>
             <w:sz w:val="24"/>
-            <w:highlight w:val="yellow"/>
           </w:rPr>
         </w:sdtPr>
         <w:sdtContent>
@@ -805,7 +790,6 @@
             <w:rPr>
               <w:rFonts w:ascii="Times New Roman" w:hAnsi="Times New Roman" w:cs="Times New Roman"/>
               <w:sz w:val="24"/>
-              <w:highlight w:val="yellow"/>
             </w:rPr>
             <w:t>Huang, Jonathan</w:t>
           </w:r>
@@ -828,7 +812,6 @@
             <w:spacing w:val="-3"/>
             <w:sz w:val="24"/>
             <w:szCs w:val="24"/>
-            <w:highlight w:val="yellow"/>
           </w:rPr>
         </w:sdtPr>
         <w:sdtContent>
@@ -838,7 +821,6 @@
               <w:spacing w:val="-3"/>
               <w:sz w:val="24"/>
               <w:szCs w:val="24"/>
-              <w:highlight w:val="yellow"/>
             </w:rPr>
             <w:t xml:space="preserve">July 16, 2025 at  9:00AM</w:t>
           </w:r>
@@ -1103,7 +1085,6 @@
             <w:spacing w:val="-3"/>
             <w:sz w:val="24"/>
             <w:szCs w:val="24"/>
-            <w:highlight w:val="yellow"/>
             <w:u w:val="single"/>
           </w:rPr>
         </w:sdtPr>
@@ -1114,7 +1095,6 @@
               <w:spacing w:val="-3"/>
               <w:sz w:val="24"/>
               <w:szCs w:val="24"/>
-              <w:highlight w:val="yellow"/>
               <w:u w:val="single"/>
             </w:rPr>
             <w:t xml:space="preserve">March 04, 2024</w:t>
@@ -1345,7 +1325,6 @@
             <w:spacing w:val="-3"/>
             <w:sz w:val="24"/>
             <w:szCs w:val="24"/>
-            <w:highlight w:val="yellow"/>
             <w:u w:val="single"/>
           </w:rPr>
         </w:sdtPr>
@@ -1357,7 +1336,6 @@
               <w:spacing w:val="-3"/>
               <w:sz w:val="24"/>
               <w:szCs w:val="24"/>
-              <w:highlight w:val="yellow"/>
               <w:u w:val="single"/>
             </w:rPr>
             <w:t xml:space="preserve">1 through 4</w:t>
@@ -1419,7 +1397,6 @@
             <w:spacing w:val="-3"/>
             <w:sz w:val="24"/>
             <w:szCs w:val="24"/>
-            <w:highlight w:val="yellow"/>
             <w:u w:val="single"/>
           </w:rPr>
         </w:sdtPr>
@@ -1431,7 +1408,6 @@
               <w:spacing w:val="-3"/>
               <w:sz w:val="24"/>
               <w:szCs w:val="24"/>
-              <w:highlight w:val="yellow"/>
               <w:u w:val="single"/>
             </w:rPr>
             <w:t>212(a)(6)(A)(i)</w:t>
@@ -1444,7 +1420,6 @@
           <w:spacing w:val="-3"/>
           <w:sz w:val="24"/>
           <w:szCs w:val="24"/>
-          <w:highlight w:val="yellow"/>
         </w:rPr>
         <w:t>,</w:t>
       </w:r>
@@ -1836,7 +1811,6 @@
             <w:spacing w:val="-3"/>
             <w:sz w:val="24"/>
             <w:szCs w:val="24"/>
-            <w:highlight w:val="yellow"/>
             <w:u w:val="single"/>
           </w:rPr>
         </w:sdtPr>
@@ -1848,7 +1822,6 @@
               <w:spacing w:val="-3"/>
               <w:sz w:val="24"/>
               <w:szCs w:val="24"/>
-              <w:highlight w:val="yellow"/>
               <w:u w:val="single"/>
             </w:rPr>
             <w:t>Spanish</w:t>
@@ -1960,7 +1933,6 @@
           <w:spacing w:val="-3"/>
           <w:sz w:val="24"/>
           <w:szCs w:val="24"/>
-          <w:highlight w:val="yellow"/>
         </w:rPr>
         <w:t xml:space="preserve">Date: </w:t>
         <w:fldChar w:fldCharType="begin"/>
@@ -1974,7 +1946,6 @@
           <w:spacing w:val="-3"/>
           <w:sz w:val="24"/>
           <w:szCs w:val="24"/>
-          <w:highlight w:val="yellow"/>
         </w:rPr>
         <w:t>May 23, 2025</w:t>
       </w:r>
@@ -1984,7 +1955,6 @@
           <w:spacing w:val="-3"/>
           <w:sz w:val="24"/>
           <w:szCs w:val="24"/>
-          <w:highlight w:val="yellow"/>
         </w:rPr>
         <w:fldChar w:fldCharType="end"/>
       </w:r>
@@ -2114,7 +2084,6 @@
             <w:spacing w:val="-3"/>
             <w:sz w:val="24"/>
             <w:szCs w:val="24"/>
-            <w:highlight w:val="yellow"/>
           </w:rPr>
         </w:sdtPr>
         <w:sdtContent>
@@ -2124,7 +2093,6 @@
               <w:spacing w:val="-3"/>
               <w:sz w:val="24"/>
               <w:szCs w:val="24"/>
-              <w:highlight w:val="yellow"/>
             </w:rPr>
             <w:t>Raul Mejia Santos</w:t>
           </w:r>
@@ -2182,16 +2150,14 @@
         <w:tab/>
         <w:tab/>
         <w:tab/>
-        <w:tab/>
-        <w:t xml:space="preserve">                      </w:t>
-      </w:r>
-      <w:r>
-        <w:rPr>
-          <w:rFonts w:ascii="Times New Roman" w:hAnsi="Times New Roman" w:cs="Times New Roman"/>
-          <w:sz w:val="24"/>
-          <w:szCs w:val="24"/>
-        </w:rPr>
-        <w:t xml:space="preserve"> </w:t>
+      </w:r>
+      <w:r>
+        <w:rPr>
+          <w:rFonts w:ascii="Times New Roman" w:hAnsi="Times New Roman" w:cs="Times New Roman"/>
+          <w:sz w:val="24"/>
+          <w:szCs w:val="24"/>
+        </w:rPr>
+        <w:t xml:space="preserve">  </w:t>
       </w:r>
       <w:sdt>
         <w:sdtPr>
@@ -2200,7 +2166,6 @@
             <w:rFonts w:ascii="Times New Roman" w:hAnsi="Times New Roman" w:cs="Times New Roman"/>
             <w:sz w:val="24"/>
             <w:szCs w:val="24"/>
-            <w:highlight w:val="yellow"/>
           </w:rPr>
         </w:sdtPr>
         <w:sdtContent>
@@ -2209,7 +2174,6 @@
               <w:rFonts w:ascii="Times New Roman" w:hAnsi="Times New Roman" w:cs="Times New Roman"/>
               <w:sz w:val="24"/>
               <w:szCs w:val="24"/>
-              <w:highlight w:val="yellow"/>
             </w:rPr>
             <w:t>INSUASTI RUIZ, EDWIN ALBERTO</w:t>
           </w:r>
@@ -2696,7 +2660,6 @@
             <w:rFonts w:ascii="Times New Roman" w:hAnsi="Times New Roman" w:cs="Times New Roman"/>
             <w:sz w:val="24"/>
             <w:szCs w:val="24"/>
-            <w:highlight w:val="yellow"/>
           </w:rPr>
         </w:sdtPr>
         <w:sdtContent>
@@ -2705,7 +2668,6 @@
               <w:rFonts w:ascii="Times New Roman" w:hAnsi="Times New Roman" w:cs="Times New Roman"/>
               <w:sz w:val="24"/>
               <w:szCs w:val="24"/>
-              <w:highlight w:val="yellow"/>
             </w:rPr>
             <w:t xml:space="preserve">INSUASTI RUIZ, EDWIN ALBERTO</w:t>
           </w:r>
@@ -2925,7 +2887,6 @@
           <w:spacing w:val="-3"/>
           <w:sz w:val="24"/>
           <w:szCs w:val="24"/>
-          <w:highlight w:val="yellow"/>
           <w:lang w:val="es-MX"/>
         </w:rPr>
         <w:t xml:space="preserve">Date: </w:t>
@@ -2937,7 +2898,6 @@
           <w:spacing w:val="-3"/>
           <w:sz w:val="24"/>
           <w:szCs w:val="24"/>
-          <w:highlight w:val="yellow"/>
         </w:rPr>
         <w:instrText xml:space="preserve"> DATE \@ "MMMM d, yyyy" </w:instrText>
       </w:r>
@@ -2947,7 +2907,6 @@
           <w:spacing w:val="-3"/>
           <w:sz w:val="24"/>
           <w:szCs w:val="24"/>
-          <w:highlight w:val="yellow"/>
           <w:lang w:val="es-MX"/>
         </w:rPr>
         <w:fldChar w:fldCharType="separate"/>
@@ -2959,7 +2918,6 @@
           <w:spacing w:val="-3"/>
           <w:sz w:val="24"/>
           <w:szCs w:val="24"/>
-          <w:highlight w:val="yellow"/>
         </w:rPr>
         <w:t>May 23, 2025</w:t>
       </w:r>
@@ -2969,7 +2927,6 @@
           <w:spacing w:val="-3"/>
           <w:sz w:val="24"/>
           <w:szCs w:val="24"/>
-          <w:highlight w:val="yellow"/>
           <w:lang w:val="es-MX"/>
         </w:rPr>
         <w:fldChar w:fldCharType="end"/>
@@ -3039,8 +2996,14 @@
         <w:tab/>
         <w:tab/>
         <w:tab/>
-        <w:tab/>
-        <w:tab/>
+      </w:r>
+      <w:r>
+        <w:rPr>
+          <w:rFonts w:ascii="Times New Roman" w:hAnsi="Times New Roman" w:cs="Times New Roman"/>
+          <w:sz w:val="24"/>
+          <w:szCs w:val="24"/>
+          <w:lang w:val="es-MX"/>
+        </w:rPr>
         <w:t xml:space="preserve"> </w:t>
       </w:r>
       <w:r>
@@ -3059,7 +3022,6 @@
             <w:rFonts w:ascii="Times New Roman" w:hAnsi="Times New Roman" w:cs="Times New Roman"/>
             <w:sz w:val="24"/>
             <w:szCs w:val="24"/>
-            <w:highlight w:val="yellow"/>
             <w:lang w:val="es-MX"/>
           </w:rPr>
         </w:sdtPr>
@@ -3069,7 +3031,6 @@
               <w:rFonts w:ascii="Times New Roman" w:hAnsi="Times New Roman" w:cs="Times New Roman"/>
               <w:sz w:val="24"/>
               <w:szCs w:val="24"/>
-              <w:highlight w:val="yellow"/>
               <w:lang w:val="es-MX"/>
             </w:rPr>
             <w:t>INSUASTI RUIZ, EDWIN ALBERTO</w:t>
@@ -4076,7 +4037,6 @@
             <w:rFonts w:ascii="Times New Roman" w:hAnsi="Times New Roman" w:cs="Times New Roman"/>
             <w:sz w:val="24"/>
             <w:szCs w:val="24"/>
-            <w:highlight w:val="yellow"/>
             <w:lang w:val="es-MX"/>
           </w:rPr>
         </w:sdtPr>
@@ -4086,7 +4046,6 @@
               <w:rFonts w:ascii="Times New Roman" w:hAnsi="Times New Roman" w:cs="Times New Roman"/>
               <w:sz w:val="24"/>
               <w:szCs w:val="24"/>
-              <w:highlight w:val="yellow"/>
               <w:lang w:val="es-MX"/>
             </w:rPr>
             <w:t xml:space="preserve">INSUASTI RUIZ, EDWIN ALBERTO</w:t>
@@ -4351,7 +4310,6 @@
           <w:spacing w:val="-3"/>
           <w:sz w:val="24"/>
           <w:szCs w:val="24"/>
-          <w:highlight w:val="yellow"/>
           <w:lang w:val="es-MX"/>
         </w:rPr>
         <w:t>23/05/202</w:t>
@@ -4457,8 +4415,6 @@
           <w:szCs w:val="24"/>
           <w:lang w:val="es-MX"/>
         </w:rPr>
-        <w:tab/>
-        <w:tab/>
         <w:tab/>
         <w:tab/>
         <w:tab/>
@@ -4489,7 +4445,6 @@
             <w:rFonts w:ascii="Times New Roman" w:hAnsi="Times New Roman" w:cs="Times New Roman"/>
             <w:sz w:val="24"/>
             <w:szCs w:val="24"/>
-            <w:highlight w:val="yellow"/>
           </w:rPr>
         </w:sdtPr>
         <w:sdtContent>
@@ -4498,7 +4453,6 @@
               <w:rFonts w:ascii="Times New Roman" w:hAnsi="Times New Roman" w:cs="Times New Roman"/>
               <w:sz w:val="24"/>
               <w:szCs w:val="24"/>
-              <w:highlight w:val="yellow"/>
             </w:rPr>
             <w:t>INSUASTI RUIZ, EDWIN ALBERTO</w:t>
           </w:r>
@@ -4687,7 +4641,6 @@
           <w:rFonts w:ascii="Times New Roman" w:hAnsi="Times New Roman" w:cs="Times New Roman"/>
           <w:sz w:val="24"/>
           <w:szCs w:val="24"/>
-          <w:highlight w:val="yellow"/>
         </w:rPr>
       </w:pPr>
       <w:sdt>
@@ -4697,7 +4650,6 @@
             <w:rFonts w:ascii="Times New Roman" w:hAnsi="Times New Roman" w:cs="Times New Roman"/>
             <w:sz w:val="24"/>
             <w:szCs w:val="24"/>
-            <w:highlight w:val="yellow"/>
           </w:rPr>
         </w:sdtPr>
         <w:sdtContent>
@@ -4706,7 +4658,6 @@
               <w:rFonts w:ascii="Times New Roman" w:hAnsi="Times New Roman" w:cs="Times New Roman"/>
               <w:sz w:val="24"/>
               <w:szCs w:val="24"/>
-              <w:highlight w:val="yellow"/>
             </w:rPr>
             <w:t>INSUASTI RUIZ, EDWIN ALBERTO</w:t>
           </w:r>
@@ -4723,7 +4674,6 @@
           <w:rFonts w:ascii="Times New Roman" w:hAnsi="Times New Roman" w:cs="Times New Roman"/>
           <w:sz w:val="24"/>
           <w:szCs w:val="24"/>
-          <w:highlight w:val="yellow"/>
         </w:rPr>
         <w:t>A#</w:t>
       </w:r>
@@ -4733,7 +4683,6 @@
           <w:color w:val="000000"/>
           <w:sz w:val="30"/>
           <w:szCs w:val="30"/>
-          <w:highlight w:val="yellow"/>
           <w:shd w:val="clear" w:color="auto" w:fill="FFFFFF"/>
         </w:rPr>
         <w:t xml:space="preserve"> </w:t>
@@ -4745,7 +4694,6 @@
             <w:rFonts w:ascii="Times New Roman" w:hAnsi="Times New Roman" w:cs="Times New Roman"/>
             <w:sz w:val="24"/>
             <w:szCs w:val="24"/>
-            <w:highlight w:val="yellow"/>
           </w:rPr>
         </w:sdtPr>
         <w:sdtContent>
@@ -4754,7 +4702,6 @@
               <w:rFonts w:ascii="Times New Roman" w:hAnsi="Times New Roman" w:cs="Times New Roman"/>
               <w:sz w:val="24"/>
               <w:szCs w:val="24"/>
-              <w:highlight w:val="yellow"/>
             </w:rPr>
             <w:t>245-870-935</w:t>
           </w:r>
@@ -4820,7 +4767,6 @@
             <w:color w:val="000000"/>
             <w:sz w:val="24"/>
             <w:szCs w:val="24"/>
-            <w:highlight w:val="yellow"/>
           </w:rPr>
         </w:sdtPr>
         <w:sdtContent>
@@ -4830,7 +4776,6 @@
               <w:color w:val="000000"/>
               <w:sz w:val="24"/>
               <w:szCs w:val="24"/>
-              <w:highlight w:val="yellow"/>
             </w:rPr>
             <w:t>Livan Avila</w:t>
           </w:r>
@@ -4853,7 +4798,6 @@
           <w:color w:val="000000"/>
           <w:sz w:val="24"/>
           <w:szCs w:val="24"/>
-          <w:highlight w:val="yellow"/>
         </w:rPr>
         <w:t>WRITTEN PLEADINGS</w:t>
       </w:r>
@@ -4964,7 +4908,6 @@
             <w:color w:val="000000"/>
             <w:sz w:val="24"/>
             <w:szCs w:val="24"/>
-            <w:highlight w:val="yellow"/>
           </w:rPr>
         </w:sdtPr>
         <w:sdtContent>
@@ -4974,7 +4917,6 @@
               <w:color w:val="000000"/>
               <w:sz w:val="24"/>
               <w:szCs w:val="24"/>
-              <w:highlight w:val="yellow"/>
             </w:rPr>
             <w:t>LIVAN AVILA</w:t>
           </w:r>
@@ -5092,7 +5034,6 @@
           <w:color w:val="000000"/>
           <w:sz w:val="24"/>
           <w:szCs w:val="24"/>
-          <w:highlight w:val="yellow"/>
         </w:rPr>
         <w:t>2100</w:t>
       </w:r>

</xml_diff>

<commit_message>
written-pleadings: quita el relleno de párrafos vacíos redundante
Con los pageBreakBefore reales agregados antes (commit 514df6a), el
relleno de párrafos vacíos que simulaba el salto a mano quedó redundante
y sumaba una página en blanco extra antes de cada salto real. Se quitó
(27/17/16 párrafos en las 3 secciones), con cuidado de no tocar el cuadro
de texto flotante "Certificate of Translation" (vive dentro de un solo
párrafo de nivel superior que contiene sus propios <w:p> internos —
requirió un tokenizer con profundidad real, no un split ingenuo).

Co-Authored-By: Claude Sonnet 5 <noreply@anthropic.com>
Claude-Session: https://claude.ai/code/session_01SWKjmpLbnm4oMbZDEtfKhm
</commit_message>
<xml_diff>
--- a/plantillas/written-pleadings/WRITTEN_PLEADINGS.docx
+++ b/plantillas/written-pleadings/WRITTEN_PLEADINGS.docx
@@ -2213,375 +2213,6 @@
         </w:rPr>
         <w:t xml:space="preserve">.        </w:t>
       </w:r>
-    </w:p>
-    <w:p>
-      <w:pPr>
-        <w:spacing w:line="200" w:lineRule="atLeast"/>
-        <w:rPr>
-          <w:rFonts w:ascii="Times New Roman" w:hAnsi="Times New Roman" w:cs="Times New Roman"/>
-          <w:i/>
-          <w:iCs/>
-          <w:spacing w:val="-3"/>
-          <w:sz w:val="24"/>
-          <w:szCs w:val="24"/>
-        </w:rPr>
-      </w:pPr>
-      <w:r>
-        <w:rPr>
-          <w:rFonts w:ascii="Times New Roman" w:hAnsi="Times New Roman" w:cs="Times New Roman"/>
-          <w:i/>
-          <w:iCs/>
-          <w:spacing w:val="-3"/>
-          <w:sz w:val="24"/>
-          <w:szCs w:val="24"/>
-        </w:rPr>
-        <w:tab/>
-        <w:tab/>
-        <w:tab/>
-        <w:tab/>
-        <w:tab/>
-        <w:tab/>
-        <w:tab/>
-      </w:r>
-    </w:p>
-    <w:p>
-      <w:pPr>
-        <w:spacing w:line="200" w:lineRule="atLeast"/>
-        <w:rPr>
-          <w:rFonts w:ascii="Times New Roman" w:hAnsi="Times New Roman" w:cs="Times New Roman"/>
-          <w:i/>
-          <w:iCs/>
-          <w:spacing w:val="-3"/>
-          <w:sz w:val="24"/>
-          <w:szCs w:val="24"/>
-        </w:rPr>
-      </w:pPr>
-    </w:p>
-    <w:p>
-      <w:pPr>
-        <w:spacing w:line="200" w:lineRule="atLeast"/>
-        <w:rPr>
-          <w:rFonts w:ascii="Times New Roman" w:hAnsi="Times New Roman" w:cs="Times New Roman"/>
-          <w:i/>
-          <w:iCs/>
-          <w:spacing w:val="-3"/>
-          <w:sz w:val="24"/>
-          <w:szCs w:val="24"/>
-        </w:rPr>
-      </w:pPr>
-    </w:p>
-    <w:p>
-      <w:pPr>
-        <w:spacing w:line="200" w:lineRule="atLeast"/>
-        <w:rPr>
-          <w:rFonts w:ascii="Times New Roman" w:hAnsi="Times New Roman" w:cs="Times New Roman"/>
-          <w:i/>
-          <w:iCs/>
-          <w:spacing w:val="-3"/>
-          <w:sz w:val="24"/>
-          <w:szCs w:val="24"/>
-        </w:rPr>
-      </w:pPr>
-    </w:p>
-    <w:p>
-      <w:pPr>
-        <w:spacing w:line="200" w:lineRule="atLeast"/>
-        <w:rPr>
-          <w:rFonts w:ascii="Times New Roman" w:hAnsi="Times New Roman" w:cs="Times New Roman"/>
-          <w:i/>
-          <w:iCs/>
-          <w:spacing w:val="-3"/>
-          <w:sz w:val="24"/>
-          <w:szCs w:val="24"/>
-        </w:rPr>
-      </w:pPr>
-    </w:p>
-    <w:p>
-      <w:pPr>
-        <w:spacing w:line="200" w:lineRule="atLeast"/>
-        <w:rPr>
-          <w:rFonts w:ascii="Times New Roman" w:hAnsi="Times New Roman" w:cs="Times New Roman"/>
-          <w:i/>
-          <w:iCs/>
-          <w:spacing w:val="-3"/>
-          <w:sz w:val="24"/>
-          <w:szCs w:val="24"/>
-        </w:rPr>
-      </w:pPr>
-    </w:p>
-    <w:p>
-      <w:pPr>
-        <w:spacing w:line="200" w:lineRule="atLeast"/>
-        <w:rPr>
-          <w:rFonts w:ascii="Times New Roman" w:hAnsi="Times New Roman" w:cs="Times New Roman"/>
-          <w:i/>
-          <w:iCs/>
-          <w:spacing w:val="-3"/>
-          <w:sz w:val="24"/>
-          <w:szCs w:val="24"/>
-        </w:rPr>
-      </w:pPr>
-    </w:p>
-    <w:p>
-      <w:pPr>
-        <w:spacing w:line="200" w:lineRule="atLeast"/>
-        <w:rPr>
-          <w:rFonts w:ascii="Times New Roman" w:hAnsi="Times New Roman" w:cs="Times New Roman"/>
-          <w:i/>
-          <w:iCs/>
-          <w:spacing w:val="-3"/>
-          <w:sz w:val="24"/>
-          <w:szCs w:val="24"/>
-        </w:rPr>
-      </w:pPr>
-    </w:p>
-    <w:p>
-      <w:pPr>
-        <w:spacing w:line="200" w:lineRule="atLeast"/>
-        <w:rPr>
-          <w:rFonts w:ascii="Times New Roman" w:hAnsi="Times New Roman" w:cs="Times New Roman"/>
-          <w:i/>
-          <w:iCs/>
-          <w:spacing w:val="-3"/>
-          <w:sz w:val="24"/>
-          <w:szCs w:val="24"/>
-        </w:rPr>
-      </w:pPr>
-    </w:p>
-    <w:p>
-      <w:pPr>
-        <w:spacing w:line="200" w:lineRule="atLeast"/>
-        <w:rPr>
-          <w:rFonts w:ascii="Times New Roman" w:hAnsi="Times New Roman" w:cs="Times New Roman"/>
-          <w:i/>
-          <w:iCs/>
-          <w:spacing w:val="-3"/>
-          <w:sz w:val="24"/>
-          <w:szCs w:val="24"/>
-        </w:rPr>
-      </w:pPr>
-    </w:p>
-    <w:p>
-      <w:pPr>
-        <w:spacing w:line="200" w:lineRule="atLeast"/>
-        <w:rPr>
-          <w:rFonts w:ascii="Times New Roman" w:hAnsi="Times New Roman" w:cs="Times New Roman"/>
-          <w:i/>
-          <w:iCs/>
-          <w:spacing w:val="-3"/>
-          <w:sz w:val="24"/>
-          <w:szCs w:val="24"/>
-        </w:rPr>
-      </w:pPr>
-    </w:p>
-    <w:p>
-      <w:pPr>
-        <w:spacing w:line="200" w:lineRule="atLeast"/>
-        <w:rPr>
-          <w:rFonts w:ascii="Times New Roman" w:hAnsi="Times New Roman" w:cs="Times New Roman"/>
-          <w:i/>
-          <w:iCs/>
-          <w:spacing w:val="-3"/>
-          <w:sz w:val="24"/>
-          <w:szCs w:val="24"/>
-        </w:rPr>
-      </w:pPr>
-    </w:p>
-    <w:p>
-      <w:pPr>
-        <w:spacing w:line="200" w:lineRule="atLeast"/>
-        <w:rPr>
-          <w:rFonts w:ascii="Times New Roman" w:hAnsi="Times New Roman" w:cs="Times New Roman"/>
-          <w:i/>
-          <w:iCs/>
-          <w:spacing w:val="-3"/>
-          <w:sz w:val="24"/>
-          <w:szCs w:val="24"/>
-        </w:rPr>
-      </w:pPr>
-    </w:p>
-    <w:p>
-      <w:pPr>
-        <w:spacing w:line="200" w:lineRule="atLeast"/>
-        <w:rPr>
-          <w:rFonts w:ascii="Times New Roman" w:hAnsi="Times New Roman" w:cs="Times New Roman"/>
-          <w:i/>
-          <w:iCs/>
-          <w:spacing w:val="-3"/>
-          <w:sz w:val="24"/>
-          <w:szCs w:val="24"/>
-        </w:rPr>
-      </w:pPr>
-    </w:p>
-    <w:p>
-      <w:pPr>
-        <w:spacing w:line="200" w:lineRule="atLeast"/>
-        <w:rPr>
-          <w:rFonts w:ascii="Times New Roman" w:hAnsi="Times New Roman" w:cs="Times New Roman"/>
-          <w:i/>
-          <w:iCs/>
-          <w:spacing w:val="-3"/>
-          <w:sz w:val="24"/>
-          <w:szCs w:val="24"/>
-        </w:rPr>
-      </w:pPr>
-    </w:p>
-    <w:p>
-      <w:pPr>
-        <w:spacing w:line="200" w:lineRule="atLeast"/>
-        <w:rPr>
-          <w:rFonts w:ascii="Times New Roman" w:hAnsi="Times New Roman" w:cs="Times New Roman"/>
-          <w:i/>
-          <w:iCs/>
-          <w:spacing w:val="-3"/>
-          <w:sz w:val="24"/>
-          <w:szCs w:val="24"/>
-        </w:rPr>
-      </w:pPr>
-    </w:p>
-    <w:p>
-      <w:pPr>
-        <w:spacing w:line="200" w:lineRule="atLeast"/>
-        <w:rPr>
-          <w:rFonts w:ascii="Times New Roman" w:hAnsi="Times New Roman" w:cs="Times New Roman"/>
-          <w:i/>
-          <w:iCs/>
-          <w:spacing w:val="-3"/>
-          <w:sz w:val="24"/>
-          <w:szCs w:val="24"/>
-        </w:rPr>
-      </w:pPr>
-    </w:p>
-    <w:p>
-      <w:pPr>
-        <w:spacing w:line="200" w:lineRule="atLeast"/>
-        <w:rPr>
-          <w:rFonts w:ascii="Times New Roman" w:hAnsi="Times New Roman" w:cs="Times New Roman"/>
-          <w:i/>
-          <w:iCs/>
-          <w:spacing w:val="-3"/>
-          <w:sz w:val="24"/>
-          <w:szCs w:val="24"/>
-        </w:rPr>
-      </w:pPr>
-    </w:p>
-    <w:p>
-      <w:pPr>
-        <w:spacing w:line="200" w:lineRule="atLeast"/>
-        <w:rPr>
-          <w:rFonts w:ascii="Times New Roman" w:hAnsi="Times New Roman" w:cs="Times New Roman"/>
-          <w:i/>
-          <w:iCs/>
-          <w:spacing w:val="-3"/>
-          <w:sz w:val="24"/>
-          <w:szCs w:val="24"/>
-        </w:rPr>
-      </w:pPr>
-    </w:p>
-    <w:p>
-      <w:pPr>
-        <w:spacing w:line="200" w:lineRule="atLeast"/>
-        <w:rPr>
-          <w:rFonts w:ascii="Times New Roman" w:hAnsi="Times New Roman" w:cs="Times New Roman"/>
-          <w:i/>
-          <w:iCs/>
-          <w:spacing w:val="-3"/>
-          <w:sz w:val="24"/>
-          <w:szCs w:val="24"/>
-        </w:rPr>
-      </w:pPr>
-    </w:p>
-    <w:p>
-      <w:pPr>
-        <w:spacing w:line="200" w:lineRule="atLeast"/>
-        <w:rPr>
-          <w:rFonts w:ascii="Times New Roman" w:hAnsi="Times New Roman" w:cs="Times New Roman"/>
-          <w:i/>
-          <w:iCs/>
-          <w:spacing w:val="-3"/>
-          <w:sz w:val="24"/>
-          <w:szCs w:val="24"/>
-        </w:rPr>
-      </w:pPr>
-    </w:p>
-    <w:p>
-      <w:pPr>
-        <w:spacing w:line="200" w:lineRule="atLeast"/>
-        <w:rPr>
-          <w:rFonts w:ascii="Times New Roman" w:hAnsi="Times New Roman" w:cs="Times New Roman"/>
-          <w:i/>
-          <w:iCs/>
-          <w:spacing w:val="-3"/>
-          <w:sz w:val="24"/>
-          <w:szCs w:val="24"/>
-        </w:rPr>
-      </w:pPr>
-    </w:p>
-    <w:p>
-      <w:pPr>
-        <w:spacing w:line="200" w:lineRule="atLeast"/>
-        <w:rPr>
-          <w:rFonts w:ascii="Times New Roman" w:hAnsi="Times New Roman" w:cs="Times New Roman"/>
-          <w:i/>
-          <w:iCs/>
-          <w:spacing w:val="-3"/>
-          <w:sz w:val="24"/>
-          <w:szCs w:val="24"/>
-        </w:rPr>
-      </w:pPr>
-    </w:p>
-    <w:p>
-      <w:pPr>
-        <w:spacing w:line="200" w:lineRule="atLeast"/>
-        <w:rPr>
-          <w:rFonts w:ascii="Times New Roman" w:hAnsi="Times New Roman" w:cs="Times New Roman"/>
-          <w:i/>
-          <w:iCs/>
-          <w:spacing w:val="-3"/>
-          <w:sz w:val="24"/>
-          <w:szCs w:val="24"/>
-        </w:rPr>
-      </w:pPr>
-    </w:p>
-    <w:p>
-      <w:pPr>
-        <w:spacing w:line="200" w:lineRule="atLeast"/>
-        <w:rPr>
-          <w:rFonts w:ascii="Times New Roman" w:hAnsi="Times New Roman" w:cs="Times New Roman"/>
-          <w:i/>
-          <w:iCs/>
-          <w:spacing w:val="-3"/>
-          <w:sz w:val="24"/>
-          <w:szCs w:val="24"/>
-        </w:rPr>
-      </w:pPr>
-    </w:p>
-    <w:p>
-      <w:pPr>
-        <w:spacing w:line="200" w:lineRule="atLeast"/>
-        <w:rPr>
-          <w:rFonts w:ascii="Times New Roman" w:hAnsi="Times New Roman" w:cs="Times New Roman"/>
-          <w:i/>
-          <w:iCs/>
-          <w:spacing w:val="-3"/>
-          <w:sz w:val="24"/>
-          <w:szCs w:val="24"/>
-        </w:rPr>
-      </w:pPr>
-    </w:p>
-    <w:p>
-      <w:pPr>
-        <w:spacing w:line="100" w:lineRule="atLeast"/>
-        <w:jc w:val="center"/>
-        <w:rPr>
-          <w:rFonts w:ascii="Times New Roman" w:hAnsi="Times New Roman" w:cs="Times New Roman"/>
-          <w:b/>
-          <w:bCs/>
-          <w:spacing w:val="-3"/>
-          <w:sz w:val="24"/>
-          <w:szCs w:val="24"/>
-        </w:rPr>
-      </w:pPr>
     </w:p>
     <w:p>
       <w:pPr>
@@ -3740,220 +3371,6 @@
     </w:p>
     <w:p>
       <w:pPr>
-        <w:spacing w:line="240" w:lineRule="auto"/>
-        <w:rPr>
-          <w:lang w:val="es-MX"/>
-        </w:rPr>
-      </w:pPr>
-    </w:p>
-    <w:p>
-      <w:pPr>
-        <w:spacing w:line="240" w:lineRule="auto"/>
-        <w:rPr>
-          <w:lang w:val="es-MX"/>
-        </w:rPr>
-      </w:pPr>
-    </w:p>
-    <w:p>
-      <w:pPr>
-        <w:pStyle w:val="SingleSpacing"/>
-        <w:spacing w:line="240" w:lineRule="auto"/>
-        <w:rPr>
-          <w:rFonts w:ascii="Times New Roman" w:hAnsi="Times New Roman" w:cs="Times New Roman"/>
-          <w:iCs/>
-          <w:spacing w:val="-3"/>
-          <w:sz w:val="24"/>
-          <w:szCs w:val="24"/>
-          <w:lang w:val="es-MX"/>
-        </w:rPr>
-      </w:pPr>
-    </w:p>
-    <w:p>
-      <w:pPr>
-        <w:spacing w:line="480" w:lineRule="auto"/>
-        <w:rPr>
-          <w:rFonts w:ascii="Times New Roman" w:hAnsi="Times New Roman" w:cs="Times New Roman"/>
-          <w:spacing w:val="-3"/>
-          <w:sz w:val="24"/>
-          <w:szCs w:val="24"/>
-          <w:lang w:val="es-MX"/>
-        </w:rPr>
-      </w:pPr>
-    </w:p>
-    <w:p>
-      <w:pPr>
-        <w:spacing w:line="100" w:lineRule="atLeast"/>
-        <w:rPr>
-          <w:rFonts w:ascii="Times New Roman" w:hAnsi="Times New Roman" w:cs="Times New Roman"/>
-          <w:b/>
-          <w:bCs/>
-          <w:spacing w:val="-3"/>
-          <w:sz w:val="24"/>
-          <w:szCs w:val="24"/>
-          <w:lang w:val="es-MX"/>
-        </w:rPr>
-      </w:pPr>
-    </w:p>
-    <w:p>
-      <w:pPr>
-        <w:spacing w:line="100" w:lineRule="atLeast"/>
-        <w:rPr>
-          <w:rFonts w:ascii="Times New Roman" w:hAnsi="Times New Roman" w:cs="Times New Roman"/>
-          <w:b/>
-          <w:bCs/>
-          <w:spacing w:val="-3"/>
-          <w:sz w:val="24"/>
-          <w:szCs w:val="24"/>
-          <w:lang w:val="es-MX"/>
-        </w:rPr>
-      </w:pPr>
-    </w:p>
-    <w:p>
-      <w:pPr>
-        <w:spacing w:line="100" w:lineRule="atLeast"/>
-        <w:rPr>
-          <w:rFonts w:ascii="Times New Roman" w:hAnsi="Times New Roman" w:cs="Times New Roman"/>
-          <w:b/>
-          <w:bCs/>
-          <w:spacing w:val="-3"/>
-          <w:sz w:val="24"/>
-          <w:szCs w:val="24"/>
-          <w:lang w:val="es-MX"/>
-        </w:rPr>
-      </w:pPr>
-    </w:p>
-    <w:p>
-      <w:pPr>
-        <w:spacing w:line="100" w:lineRule="atLeast"/>
-        <w:rPr>
-          <w:rFonts w:ascii="Times New Roman" w:hAnsi="Times New Roman" w:cs="Times New Roman"/>
-          <w:b/>
-          <w:bCs/>
-          <w:spacing w:val="-3"/>
-          <w:sz w:val="24"/>
-          <w:szCs w:val="24"/>
-          <w:lang w:val="es-MX"/>
-        </w:rPr>
-      </w:pPr>
-    </w:p>
-    <w:p>
-      <w:pPr>
-        <w:spacing w:line="100" w:lineRule="atLeast"/>
-        <w:rPr>
-          <w:rFonts w:ascii="Times New Roman" w:hAnsi="Times New Roman" w:cs="Times New Roman"/>
-          <w:b/>
-          <w:bCs/>
-          <w:spacing w:val="-3"/>
-          <w:sz w:val="24"/>
-          <w:szCs w:val="24"/>
-          <w:lang w:val="es-MX"/>
-        </w:rPr>
-      </w:pPr>
-    </w:p>
-    <w:p>
-      <w:pPr>
-        <w:spacing w:line="100" w:lineRule="atLeast"/>
-        <w:rPr>
-          <w:rFonts w:ascii="Times New Roman" w:hAnsi="Times New Roman" w:cs="Times New Roman"/>
-          <w:b/>
-          <w:bCs/>
-          <w:spacing w:val="-3"/>
-          <w:sz w:val="24"/>
-          <w:szCs w:val="24"/>
-          <w:lang w:val="es-MX"/>
-        </w:rPr>
-      </w:pPr>
-    </w:p>
-    <w:p>
-      <w:pPr>
-        <w:spacing w:line="100" w:lineRule="atLeast"/>
-        <w:rPr>
-          <w:rFonts w:ascii="Times New Roman" w:hAnsi="Times New Roman" w:cs="Times New Roman"/>
-          <w:b/>
-          <w:bCs/>
-          <w:spacing w:val="-3"/>
-          <w:sz w:val="24"/>
-          <w:szCs w:val="24"/>
-          <w:lang w:val="es-MX"/>
-        </w:rPr>
-      </w:pPr>
-    </w:p>
-    <w:p>
-      <w:pPr>
-        <w:spacing w:line="100" w:lineRule="atLeast"/>
-        <w:rPr>
-          <w:rFonts w:ascii="Times New Roman" w:hAnsi="Times New Roman" w:cs="Times New Roman"/>
-          <w:b/>
-          <w:bCs/>
-          <w:spacing w:val="-3"/>
-          <w:sz w:val="24"/>
-          <w:szCs w:val="24"/>
-          <w:lang w:val="es-MX"/>
-        </w:rPr>
-      </w:pPr>
-    </w:p>
-    <w:p>
-      <w:pPr>
-        <w:spacing w:line="100" w:lineRule="atLeast"/>
-        <w:rPr>
-          <w:rFonts w:ascii="Times New Roman" w:hAnsi="Times New Roman" w:cs="Times New Roman"/>
-          <w:spacing w:val="-3"/>
-          <w:sz w:val="24"/>
-          <w:szCs w:val="24"/>
-          <w:lang w:val="es-MX"/>
-        </w:rPr>
-      </w:pPr>
-    </w:p>
-    <w:p>
-      <w:pPr>
-        <w:spacing w:line="100" w:lineRule="atLeast"/>
-        <w:rPr>
-          <w:rFonts w:ascii="Times New Roman" w:hAnsi="Times New Roman" w:cs="Times New Roman"/>
-          <w:spacing w:val="-3"/>
-          <w:sz w:val="24"/>
-          <w:szCs w:val="24"/>
-          <w:lang w:val="es-MX"/>
-        </w:rPr>
-      </w:pPr>
-    </w:p>
-    <w:p>
-      <w:pPr>
-        <w:spacing w:line="100" w:lineRule="atLeast"/>
-        <w:rPr>
-          <w:rFonts w:ascii="Times New Roman" w:hAnsi="Times New Roman" w:cs="Times New Roman"/>
-          <w:spacing w:val="-3"/>
-          <w:sz w:val="24"/>
-          <w:szCs w:val="24"/>
-          <w:lang w:val="es-MX"/>
-        </w:rPr>
-      </w:pPr>
-    </w:p>
-    <w:p>
-      <w:pPr>
-        <w:spacing w:line="100" w:lineRule="atLeast"/>
-        <w:rPr>
-          <w:rFonts w:ascii="Times New Roman" w:hAnsi="Times New Roman" w:cs="Times New Roman"/>
-          <w:spacing w:val="-3"/>
-          <w:sz w:val="24"/>
-          <w:szCs w:val="24"/>
-          <w:lang w:val="es-MX"/>
-        </w:rPr>
-      </w:pPr>
-    </w:p>
-    <w:p>
-      <w:pPr>
-        <w:spacing w:line="100" w:lineRule="atLeast"/>
-        <w:rPr>
-          <w:rFonts w:ascii="Times New Roman" w:hAnsi="Times New Roman" w:cs="Times New Roman"/>
-          <w:spacing w:val="-3"/>
-          <w:sz w:val="24"/>
-          <w:szCs w:val="24"/>
-          <w:lang w:val="es-MX"/>
-        </w:rPr>
-      </w:pPr>
-    </w:p>
-    <w:p>
-      <w:pPr>
         <w:pageBreakBefore/>
         <w:spacing w:line="100" w:lineRule="atLeast"/>
         <w:jc w:val="center"/>
@@ -4463,177 +3880,6 @@
       <w:r>
         <w:t xml:space="preserve">        </w:t>
       </w:r>
-    </w:p>
-    <w:p>
-      <w:pPr>
-        <w:spacing w:line="240" w:lineRule="auto"/>
-      </w:pPr>
-    </w:p>
-    <w:p>
-      <w:pPr>
-        <w:spacing w:line="100" w:lineRule="atLeast"/>
-        <w:rPr>
-          <w:rFonts w:ascii="Times New Roman" w:hAnsi="Times New Roman" w:cs="Times New Roman"/>
-          <w:spacing w:val="-3"/>
-          <w:sz w:val="24"/>
-          <w:szCs w:val="24"/>
-        </w:rPr>
-      </w:pPr>
-    </w:p>
-    <w:p>
-      <w:pPr>
-        <w:spacing w:line="100" w:lineRule="atLeast"/>
-        <w:rPr>
-          <w:rFonts w:ascii="Times New Roman" w:hAnsi="Times New Roman" w:cs="Times New Roman"/>
-          <w:spacing w:val="-3"/>
-          <w:sz w:val="24"/>
-          <w:szCs w:val="24"/>
-        </w:rPr>
-      </w:pPr>
-    </w:p>
-    <w:p>
-      <w:pPr>
-        <w:spacing w:line="100" w:lineRule="atLeast"/>
-        <w:rPr>
-          <w:rFonts w:ascii="Times New Roman" w:hAnsi="Times New Roman" w:cs="Times New Roman"/>
-          <w:spacing w:val="-3"/>
-          <w:sz w:val="24"/>
-          <w:szCs w:val="24"/>
-        </w:rPr>
-      </w:pPr>
-    </w:p>
-    <w:p>
-      <w:pPr>
-        <w:spacing w:line="100" w:lineRule="atLeast"/>
-        <w:rPr>
-          <w:rFonts w:ascii="Times New Roman" w:hAnsi="Times New Roman" w:cs="Times New Roman"/>
-          <w:spacing w:val="-3"/>
-          <w:sz w:val="24"/>
-          <w:szCs w:val="24"/>
-        </w:rPr>
-      </w:pPr>
-    </w:p>
-    <w:p>
-      <w:pPr>
-        <w:shd w:val="clear" w:color="auto" w:fill="FFFFFF"/>
-        <w:spacing w:after="160" w:line="550" w:lineRule="atLeast"/>
-        <w:rPr>
-          <w:rFonts w:ascii="Calibri" w:hAnsi="Calibri" w:cs="Calibri"/>
-          <w:color w:val="222222"/>
-          <w:sz w:val="22"/>
-          <w:szCs w:val="22"/>
-        </w:rPr>
-      </w:pPr>
-    </w:p>
-    <w:p>
-      <w:pPr>
-        <w:spacing w:line="100" w:lineRule="atLeast"/>
-        <w:rPr>
-          <w:rFonts w:ascii="Times New Roman" w:hAnsi="Times New Roman" w:cs="Times New Roman"/>
-          <w:spacing w:val="-3"/>
-          <w:sz w:val="24"/>
-          <w:szCs w:val="24"/>
-        </w:rPr>
-      </w:pPr>
-    </w:p>
-    <w:p>
-      <w:pPr>
-        <w:spacing w:line="100" w:lineRule="atLeast"/>
-        <w:rPr>
-          <w:rFonts w:ascii="Times New Roman" w:hAnsi="Times New Roman" w:cs="Times New Roman"/>
-          <w:spacing w:val="-3"/>
-          <w:sz w:val="24"/>
-          <w:szCs w:val="24"/>
-        </w:rPr>
-      </w:pPr>
-    </w:p>
-    <w:p>
-      <w:pPr>
-        <w:spacing w:line="100" w:lineRule="atLeast"/>
-        <w:rPr>
-          <w:rFonts w:ascii="Times New Roman" w:hAnsi="Times New Roman" w:cs="Times New Roman"/>
-          <w:spacing w:val="-3"/>
-          <w:sz w:val="24"/>
-          <w:szCs w:val="24"/>
-        </w:rPr>
-      </w:pPr>
-    </w:p>
-    <w:p>
-      <w:pPr>
-        <w:spacing w:line="100" w:lineRule="atLeast"/>
-        <w:rPr>
-          <w:rFonts w:ascii="Times New Roman" w:hAnsi="Times New Roman" w:cs="Times New Roman"/>
-          <w:spacing w:val="-3"/>
-          <w:sz w:val="24"/>
-          <w:szCs w:val="24"/>
-        </w:rPr>
-      </w:pPr>
-    </w:p>
-    <w:p>
-      <w:pPr>
-        <w:spacing w:line="100" w:lineRule="atLeast"/>
-        <w:rPr>
-          <w:rFonts w:ascii="Times New Roman" w:hAnsi="Times New Roman" w:cs="Times New Roman"/>
-          <w:spacing w:val="-3"/>
-          <w:sz w:val="24"/>
-          <w:szCs w:val="24"/>
-        </w:rPr>
-      </w:pPr>
-    </w:p>
-    <w:p>
-      <w:pPr>
-        <w:spacing w:line="100" w:lineRule="atLeast"/>
-        <w:rPr>
-          <w:rFonts w:ascii="Times New Roman" w:hAnsi="Times New Roman" w:cs="Times New Roman"/>
-          <w:spacing w:val="-3"/>
-          <w:sz w:val="24"/>
-          <w:szCs w:val="24"/>
-        </w:rPr>
-      </w:pPr>
-    </w:p>
-    <w:p>
-      <w:pPr>
-        <w:spacing w:line="100" w:lineRule="atLeast"/>
-        <w:rPr>
-          <w:rFonts w:ascii="Times New Roman" w:hAnsi="Times New Roman" w:cs="Times New Roman"/>
-          <w:spacing w:val="-3"/>
-          <w:sz w:val="24"/>
-          <w:szCs w:val="24"/>
-        </w:rPr>
-      </w:pPr>
-    </w:p>
-    <w:p>
-      <w:pPr>
-        <w:spacing w:line="100" w:lineRule="atLeast"/>
-        <w:rPr>
-          <w:rFonts w:ascii="Times New Roman" w:hAnsi="Times New Roman" w:cs="Times New Roman"/>
-          <w:spacing w:val="-3"/>
-          <w:sz w:val="24"/>
-          <w:szCs w:val="24"/>
-        </w:rPr>
-      </w:pPr>
-    </w:p>
-    <w:p>
-      <w:pPr>
-        <w:spacing w:line="100" w:lineRule="atLeast"/>
-        <w:rPr>
-          <w:rFonts w:ascii="Times New Roman" w:hAnsi="Times New Roman" w:cs="Times New Roman"/>
-          <w:spacing w:val="-3"/>
-          <w:sz w:val="24"/>
-          <w:szCs w:val="24"/>
-        </w:rPr>
-      </w:pPr>
-    </w:p>
-    <w:p>
-      <w:pPr>
-        <w:spacing w:line="100" w:lineRule="atLeast"/>
-        <w:rPr>
-          <w:rFonts w:ascii="Times New Roman" w:hAnsi="Times New Roman" w:cs="Times New Roman"/>
-          <w:spacing w:val="-3"/>
-          <w:sz w:val="24"/>
-          <w:szCs w:val="24"/>
-        </w:rPr>
-      </w:pPr>
     </w:p>
     <w:p>
       <w:pPr>

</xml_diff>

<commit_message>
written-pleadings: cambia nombre del despacho en el membrete
Reemplaza las 4 apariciones fijas de "KOSTIV & ASSOCIATES, P.C." y
"Kostiv & Associates" (membrete, sello antes de PROOF OF SERVICE, y
el cuadro de texto Certificate of Translation) por "KOSTIV CARDINAL
INTERNATIONAL LAW GROUP", a pedido explícito del usuario. Solo afecta
esta plantilla; webex-motion mantiene su propia variante del nombre.
</commit_message>
<xml_diff>
--- a/plantillas/written-pleadings/WRITTEN_PLEADINGS.docx
+++ b/plantillas/written-pleadings/WRITTEN_PLEADINGS.docx
@@ -55,7 +55,7 @@
           <w:sz w:val="24"/>
           <w:szCs w:val="24"/>
         </w:rPr>
-        <w:t>KOSTIV &amp; ASSOCIATES, P.C.</w:t>
+        <w:t>KOSTIV CARDINAL INTERNATIONAL LAW GROUP</w:t>
       </w:r>
     </w:p>
     <w:p>
@@ -2983,7 +2983,7 @@
                                 <w:rFonts w:ascii="Times New Roman" w:hAnsi="Times New Roman" w:cs="Times New Roman"/>
                                 <w:szCs w:val="18"/>
                               </w:rPr>
-                              <w:t>Kostiv &amp; Associates</w:t>
+                              <w:t>KOSTIV CARDINAL INTERNATIONAL LAW GROUP</w:t>
                             </w:r>
                           </w:p>
                           <w:p>
@@ -3280,7 +3280,7 @@
                           <w:rFonts w:ascii="Times New Roman" w:hAnsi="Times New Roman" w:cs="Times New Roman"/>
                           <w:szCs w:val="18"/>
                         </w:rPr>
-                        <w:t>Kostiv &amp; Associates</w:t>
+                        <w:t>KOSTIV CARDINAL INTERNATIONAL LAW GROUP</w:t>
                       </w:r>
                     </w:p>
                     <w:p>
@@ -4255,7 +4255,7 @@
           <w:sz w:val="24"/>
           <w:szCs w:val="24"/>
         </w:rPr>
-        <w:t>KOSTIV &amp; ASSOCIATES, P.C.</w:t>
+        <w:t>KOSTIV CARDINAL INTERNATIONAL LAW GROUP</w:t>
       </w:r>
     </w:p>
     <w:p>

</xml_diff>